<commit_message>
fix(lecons): corrige le rendement actuariel (placement financier n°12)
- L'exemple annonçait « TRA ≈ 4,62 % + 0,31 % = 4,93 % » pour une
  obligation à 102,5 % du nominal. Deux fautes : le rendement courant
  est 4,5/102,5 = 4,39 %, et le second terme se SOUSTRAIT — acheter à
  102,5 pour être remboursé 100 est une perte de 2,5 sur 8 ans. Le
  calcul actuariel exact, refait par résolution numérique, donne
  4,13 %. L'erreur inversait le principe que l'exemple devait
  illustrer ; un repère de vérification remplace la parenthèse.
- L'OAT était notée « AA (2026) » chez S&P, qui a abaissé la France à
  A+ le 17/10/2025. La ligne porte désormais la note, sa date, celles
  de Moody's (Aa3) et Fitch (AA-), et un rappel de revérification.

Formulations d'origine conservées dans le journal des corrections.

Co-Authored-By: Claude Opus 5 <noreply@anthropic.com>
</commit_message>
<xml_diff>
--- a/livrables/lecons/2026-08-29_lecon-placement-financier_12_obligations-fonds-obligataires.docx
+++ b/livrables/lecons/2026-08-29_lecon-placement-financier_12_obligations-fonds-obligataires.docx
@@ -988,7 +988,7 @@
           <w:sz w:val="22"/>
           <w:szCs w:val="22"/>
         </w:rPr>
-        <w:t xml:space="preserve">Exemple (source : La Finance pour Tous) : obligation à 102,5 % du nominal, coupon 4,5 %, 8 ans restants → TRA ≈ 4,62 % + 0,31 % = </w:t>
+        <w:t xml:space="preserve">Exemple (source : La Finance pour Tous) : obligation à 102,5 % du nominal, coupon 4,5 %, 8 ans restants. Rendement courant = 4,5 / 102,5 = 4,39 %. Le titre est acheté AU-DESSUS du pair : on paie 102,5 pour être remboursé 100, soit une perte de 2,5 étalée sur 8 ans, environ −0,31 % par an. Ce second terme se SOUSTRAIT : 4,39 % − 0,31 % ≈ 4,08 %, et le calcul actuariel exact donne </w:t>
       </w:r>
       <w:r>
         <w:rPr>
@@ -999,16 +999,16 @@
           <w:sz w:val="22"/>
           <w:szCs w:val="22"/>
         </w:rPr>
-        <w:t xml:space="preserve">4,93 %</w:t>
-      </w:r>
-      <w:r>
-        <w:rPr>
-          <w:rFonts w:ascii="Times New Roman" w:cs="Times New Roman" w:eastAsia="Times New Roman" w:hAnsi="Times New Roman"/>
-          <w:color w:val="1F2937"/>
-          <w:sz w:val="22"/>
-          <w:szCs w:val="22"/>
-        </w:rPr>
-        <w:t xml:space="preserve">. (Le second terme est le gain/perte annualisé lié à l'écart entre prix d'achat et remboursement au pair.)</w:t>
+        <w:t xml:space="preserve">4,13 %</w:t>
+      </w:r>
+      <w:r>
+        <w:rPr>
+          <w:rFonts w:ascii="Times New Roman" w:cs="Times New Roman" w:eastAsia="Times New Roman" w:hAnsi="Times New Roman"/>
+          <w:color w:val="1F2937"/>
+          <w:sz w:val="22"/>
+          <w:szCs w:val="22"/>
+        </w:rPr>
+        <w:t xml:space="preserve">. 📌 Le sens du second terme est la seule chose à retenir ici : une obligation achetée AU-DESSUS du pair rapporte MOINS que son rendement courant, une obligation achetée AU-DESSOUS rapporte PLUS. La prime payée à l'achat est perdue au remboursement, la décote est encaissée. Si le calcul te donne un actuariel supérieur au courant sur un titre acheté à 102,5 %, c'est que le signe a été inversé.</w:t>
       </w:r>
     </w:p>
     <w:p>
@@ -1177,7 +1177,7 @@
                 <w:sz w:val="20"/>
                 <w:szCs w:val="20"/>
               </w:rPr>
-              <w:t xml:space="preserve">AA (2026)</w:t>
+              <w:t xml:space="preserve">A+ — S&amp;P a abaissé la France de AA- à A+ le 17/10/2025 (Moody's : Aa3 ; Fitch : AA-). Vérifier avant réutilisation : une notation souveraine bouge.</w:t>
             </w:r>
           </w:p>
         </w:tc>
@@ -4495,6 +4495,106 @@
           <w:szCs w:val="22"/>
         </w:rPr>
         <w:t xml:space="preserve">─ Fin de la leçon 12 / 20 — Parcours Placement financier ─</w:t>
+      </w:r>
+    </w:p>
+    <w:p>
+      <w:pPr>
+        <w:spacing w:after="120" w:before="300"/>
+      </w:pPr>
+      <w:r>
+        <w:rPr>
+          <w:rFonts w:ascii="Times New Roman" w:cs="Times New Roman" w:eastAsia="Times New Roman" w:hAnsi="Times New Roman"/>
+          <w:b/>
+          <w:bCs/>
+          <w:color w:val="1B3A6B"/>
+          <w:sz w:val="28"/>
+          <w:szCs w:val="28"/>
+        </w:rPr>
+        <w:t xml:space="preserve">📝 Journal des corrections</w:t>
+      </w:r>
+    </w:p>
+    <w:p>
+      <w:pPr>
+        <w:spacing w:after="120"/>
+      </w:pPr>
+      <w:r>
+        <w:rPr>
+          <w:rFonts w:ascii="Times New Roman" w:cs="Times New Roman" w:eastAsia="Times New Roman" w:hAnsi="Times New Roman"/>
+          <w:color w:val="1F2937"/>
+          <w:sz w:val="22"/>
+          <w:szCs w:val="22"/>
+        </w:rPr>
+        <w:t xml:space="preserve">Leçon produite et relue le 29/08/2026. Les corrections sont fondues dans le texte ci-dessus ; les formulations d'origine sont conservées ici.</w:t>
+      </w:r>
+    </w:p>
+    <w:p>
+      <w:pPr>
+        <w:spacing w:after="120"/>
+      </w:pPr>
+      <w:r>
+        <w:rPr>
+          <w:rFonts w:ascii="Times New Roman" w:cs="Times New Roman" w:eastAsia="Times New Roman" w:hAnsi="Times New Roman"/>
+          <w:color w:val="1F2937"/>
+          <w:sz w:val="22"/>
+          <w:szCs w:val="22"/>
+        </w:rPr>
+        <w:t xml:space="preserve">1. Rendement actuariel — une erreur de signe, donc de principe.</w:t>
+      </w:r>
+    </w:p>
+    <w:p>
+      <w:pPr>
+        <w:spacing w:after="120"/>
+      </w:pPr>
+      <w:r>
+        <w:rPr>
+          <w:rFonts w:ascii="Times New Roman" w:cs="Times New Roman" w:eastAsia="Times New Roman" w:hAnsi="Times New Roman"/>
+          <w:color w:val="1F2937"/>
+          <w:sz w:val="22"/>
+          <w:szCs w:val="22"/>
+        </w:rPr>
+        <w:t xml:space="preserve">Version initiale : « obligation à 102,5 % du nominal, coupon 4,5 %, 8 ans restants → TRA ≈ 4,62 % + 0,31 % = 4,93 % », suivie de « (Le second terme est le gain/perte annualisé lié à l'écart entre prix d'achat et remboursement au pair.) ». Deux fautes se cumulaient. Le rendement courant est 4,5 / 102,5 = 4,39 % et non 4,62 %. Et surtout, le second terme devait être SOUSTRAIT : acheter à 102,5 pour être remboursé 100 est une perte de 2,5 sur 8 ans, soit environ −0,31 % par an. Le calcul actuariel exact, refait le 29/08/2026 par résolution numérique de l'équation d'actualisation des huit coupons et du remboursement, donne 4,13 % — contre 4,93 % annoncés, soit 0,8 point d'écart. L'erreur inversait le principe même que l'exemple devait illustrer : une obligation achetée au-dessus du pair rapporte MOINS que son rendement courant. Un repère de vérification a été ajouté à la place de la parenthèse d'origine.</w:t>
+      </w:r>
+    </w:p>
+    <w:p>
+      <w:pPr>
+        <w:spacing w:after="120"/>
+      </w:pPr>
+      <w:r>
+        <w:rPr>
+          <w:rFonts w:ascii="Times New Roman" w:cs="Times New Roman" w:eastAsia="Times New Roman" w:hAnsi="Times New Roman"/>
+          <w:color w:val="1F2937"/>
+          <w:sz w:val="22"/>
+          <w:szCs w:val="22"/>
+        </w:rPr>
+        <w:t xml:space="preserve">2. Notation de l'État français — donnée périmée.</w:t>
+      </w:r>
+    </w:p>
+    <w:p>
+      <w:pPr>
+        <w:spacing w:after="120"/>
+      </w:pPr>
+      <w:r>
+        <w:rPr>
+          <w:rFonts w:ascii="Times New Roman" w:cs="Times New Roman" w:eastAsia="Times New Roman" w:hAnsi="Times New Roman"/>
+          <w:color w:val="1F2937"/>
+          <w:sz w:val="22"/>
+          <w:szCs w:val="22"/>
+        </w:rPr>
+        <w:t xml:space="preserve">Version initiale : le tableau des émetteurs notait l'OAT française « AA (2026) » chez Standard &amp; Poor's. L'agence a abaissé la France de AA- à A+ le 17 octobre 2025, soit deux crans sous la valeur affichée. Moody's la note Aa3 et Fitch AA- : aucune agence ne soutenait « AA ». Vérifié le 29/08/2026. La ligne porte désormais la note, sa date, celles des deux autres agences, et un rappel — une notation souveraine bouge, il faut la revérifier avant réutilisation.</w:t>
+      </w:r>
+    </w:p>
+    <w:p>
+      <w:pPr>
+        <w:spacing w:after="120"/>
+      </w:pPr>
+      <w:r>
+        <w:rPr>
+          <w:rFonts w:ascii="Times New Roman" w:cs="Times New Roman" w:eastAsia="Times New Roman" w:hAnsi="Times New Roman"/>
+          <w:color w:val="1F2937"/>
+          <w:sz w:val="22"/>
+          <w:szCs w:val="22"/>
+        </w:rPr>
+        <w:t xml:space="preserve">Vérifié lors de la relecture et inchangé : la relation inverse taux/prix et son illustration chiffrée (5 % à 100 € → ~50 € si les taux passent à 10 %, ~166 € s'ils tombent à 3 %) ; le rendement courant de l'exemple 4,8 / 96 = 5,00 % ; le coupon et le rendement de l'exercice 1 (32 € et 3,39 %) ; l'impact de sensibilité du challenge (20 000 € × 8 × 1,5 % = 2 400 €, soit 12 %) ; l'écart de frais de l'exercice 3, proche de 1 300 € sur dix ans ; et tout le tableau fiscal, qui concorde avec les leçons 10 et 11 — PFU à 31,4 %, exception à 29,2 %, acompte non libératoire de 12,8 % et seuils de dispense.</w:t>
       </w:r>
     </w:p>
     <w:sectPr>

</xml_diff>